<commit_message>
Updated the gitignore and the Project Report.
</commit_message>
<xml_diff>
--- a/Relatório/Relatório Projeto P1.docx
+++ b/Relatório/Relatório Projeto P1.docx
@@ -25,7 +25,7 @@
           <w:szCs w:val="28"/>
           <w:rtl w:val="0"/>
         </w:rPr>
-        <w:t xml:space="preserve">1. Pequena introdução</w:t>
+        <w:t xml:space="preserve">1. Introdução</w:t>
       </w:r>
       <w:r>
         <w:rPr>
@@ -37,26 +37,41 @@
       <w:pPr>
         <w:keepLines w:val="1"/>
         <w:spacing w:after="160" w:before="160" w:line="240" w:lineRule="auto"/>
+        <w:jc w:val="both"/>
         <w:rPr/>
       </w:pPr>
       <w:r>
         <w:rPr>
           <w:rtl w:val="0"/>
         </w:rPr>
-        <w:t xml:space="preserve">Este relatório documenta o desenvolvimento e a evolução de um projeto criado no GitHub, aproveitando um trabalho realizado no semestre anterior. O projeto teve início com uma reunião colaborativa, onde a equipa realizou um brainstorming e delineou a abordagem mais adequada para o seu desenvolvimento.</w:t>
+        <w:t xml:space="preserve">Este relatório documenta o desenvolvimento e a evolução de um projeto criado no GitHub, aproveitando um trabalho realizado no semestre anterior. O projeto teve início com uma reunião colaborativa, onde a equipa realizou um </w:t>
+      </w:r>
+      <w:r>
+        <w:rPr>
+          <w:i w:val="1"/>
+          <w:rtl w:val="0"/>
+        </w:rPr>
+        <w:t xml:space="preserve">brainstorming</w:t>
+      </w:r>
+      <w:r>
+        <w:rPr>
+          <w:rtl w:val="0"/>
+        </w:rPr>
+        <w:t xml:space="preserve"> e delineou a abordagem mais adequada para o seu desenvolvimento.</w:t>
       </w:r>
     </w:p>
     <w:p>
       <w:pPr>
         <w:keepLines w:val="1"/>
         <w:spacing w:after="160" w:before="160" w:line="240" w:lineRule="auto"/>
+        <w:jc w:val="both"/>
         <w:rPr/>
       </w:pPr>
       <w:r>
         <w:rPr>
           <w:rtl w:val="0"/>
         </w:rPr>
-        <w:t xml:space="preserve">Após esta fase inicial, as tarefas foram distribuídas entre os membros da equipa, sendo que cada elemento ficou responsável por uma funcionalidade ou módulo específico, desenvolvidos em </w:t>
+        <w:t xml:space="preserve">Após esta fase inicial, as tarefas foram distribuídas entre os membros da equipa, sendo que cada elemento ficou responsável por uma funcionalidade ou módulo específico, desenvolvidos em  </w:t>
       </w:r>
       <w:r>
         <w:rPr>
@@ -69,13 +84,26 @@
         <w:rPr>
           <w:rtl w:val="0"/>
         </w:rPr>
-        <w:t xml:space="preserve"> separadas.</w:t>
+        <w:t xml:space="preserve"> </w:t>
+      </w:r>
+      <w:r>
+        <w:rPr>
+          <w:rtl w:val="0"/>
+        </w:rPr>
+        <w:t xml:space="preserve">separados</w:t>
+      </w:r>
+      <w:r>
+        <w:rPr>
+          <w:rtl w:val="0"/>
+        </w:rPr>
+        <w:t xml:space="preserve">.</w:t>
       </w:r>
     </w:p>
     <w:p>
       <w:pPr>
         <w:keepLines w:val="1"/>
         <w:spacing w:after="160" w:before="160" w:line="240" w:lineRule="auto"/>
+        <w:jc w:val="both"/>
         <w:rPr/>
       </w:pPr>
       <w:r>
@@ -89,13 +117,14 @@
       <w:pPr>
         <w:keepLines w:val="1"/>
         <w:spacing w:after="160" w:before="160" w:line="240" w:lineRule="auto"/>
+        <w:jc w:val="both"/>
         <w:rPr/>
       </w:pPr>
       <w:r>
         <w:rPr>
           <w:rtl w:val="0"/>
         </w:rPr>
-        <w:t xml:space="preserve">Tal exigiu uma coordenação eficaz entre os membros, de forma a assegurar uma integração harmoniosa e a evitar conflitos durante o processo de junção (</w:t>
+        <w:t xml:space="preserve">Tal exigiu uma coordenação eficaz entre os membros, de forma a assegurar uma integração harmoniosa e evitar conflitos durante o processo de junção (</w:t>
       </w:r>
       <w:r>
         <w:rPr>
@@ -108,7 +137,7 @@
         <w:rPr>
           <w:rtl w:val="0"/>
         </w:rPr>
-        <w:t xml:space="preserve">) das diferentes </w:t>
+        <w:t xml:space="preserve">) dos diferentes </w:t>
       </w:r>
       <w:r>
         <w:rPr>
@@ -121,7 +150,7 @@
         <w:rPr>
           <w:rtl w:val="0"/>
         </w:rPr>
-        <w:t xml:space="preserve">. Para facilitar esta gestão, foi atribuído a um dos elementos da equipa o papel de responsável principal pela fusão das </w:t>
+        <w:t xml:space="preserve">. Para facilitar esta gestão, foi atribuído a um dos elementos da equipa o papel de responsável principal pela fusão dos </w:t>
       </w:r>
       <w:r>
         <w:rPr>
@@ -134,7 +163,7 @@
         <w:rPr>
           <w:rtl w:val="0"/>
         </w:rPr>
-        <w:t xml:space="preserve"> e pela atualização contínua da </w:t>
+        <w:t xml:space="preserve"> e pela atualização contínua do </w:t>
       </w:r>
       <w:r>
         <w:rPr>
@@ -167,13 +196,14 @@
       <w:pPr>
         <w:keepLines w:val="1"/>
         <w:spacing w:after="160" w:before="160" w:line="240" w:lineRule="auto"/>
+        <w:jc w:val="both"/>
         <w:rPr/>
       </w:pPr>
       <w:r>
         <w:rPr>
           <w:rtl w:val="0"/>
         </w:rPr>
-        <w:t xml:space="preserve">Neste pequeno relatório, serão abordados brevemente os seguintes temas:</w:t>
+        <w:t xml:space="preserve">Neste relatório, serão abordados brevemente os seguintes temas:</w:t>
       </w:r>
     </w:p>
     <w:p>
@@ -185,6 +215,7 @@
         </w:numPr>
         <w:spacing w:after="160" w:before="160" w:line="240" w:lineRule="auto"/>
         <w:ind w:left="720" w:hanging="360"/>
+        <w:jc w:val="both"/>
         <w:rPr>
           <w:u w:val="none"/>
         </w:rPr>
@@ -205,6 +236,7 @@
         </w:numPr>
         <w:spacing w:after="160" w:before="160" w:line="240" w:lineRule="auto"/>
         <w:ind w:left="720" w:hanging="360"/>
+        <w:jc w:val="both"/>
         <w:rPr>
           <w:u w:val="none"/>
         </w:rPr>
@@ -213,7 +245,7 @@
         <w:rPr>
           <w:rtl w:val="0"/>
         </w:rPr>
-        <w:t xml:space="preserve">Uma pequena autoavaliação:</w:t>
+        <w:t xml:space="preserve">Uma breve autoavaliação relativa a:</w:t>
       </w:r>
     </w:p>
     <w:p>
@@ -225,12 +257,13 @@
         </w:numPr>
         <w:spacing w:after="160" w:before="160" w:line="240" w:lineRule="auto"/>
         <w:ind w:left="1440" w:hanging="360"/>
-      </w:pPr>
-      <w:r>
-        <w:rPr>
-          <w:rtl w:val="0"/>
-        </w:rPr>
-        <w:t xml:space="preserve">a estruturação do código fonte;</w:t>
+        <w:jc w:val="both"/>
+      </w:pPr>
+      <w:r>
+        <w:rPr>
+          <w:rtl w:val="0"/>
+        </w:rPr>
+        <w:t xml:space="preserve">estruturação do código fonte;</w:t>
       </w:r>
     </w:p>
     <w:p>
@@ -242,12 +275,13 @@
         </w:numPr>
         <w:spacing w:after="160" w:before="160" w:line="240" w:lineRule="auto"/>
         <w:ind w:left="1440" w:hanging="360"/>
-      </w:pPr>
-      <w:r>
-        <w:rPr>
-          <w:rtl w:val="0"/>
-        </w:rPr>
-        <w:t xml:space="preserve">a qualidade e correção da programação em C;</w:t>
+        <w:jc w:val="both"/>
+      </w:pPr>
+      <w:r>
+        <w:rPr>
+          <w:rtl w:val="0"/>
+        </w:rPr>
+        <w:t xml:space="preserve">qualidade e correção da programação em C;</w:t>
       </w:r>
     </w:p>
     <w:p>
@@ -259,12 +293,13 @@
         </w:numPr>
         <w:spacing w:after="160" w:before="160" w:line="240" w:lineRule="auto"/>
         <w:ind w:left="1440" w:hanging="360"/>
-      </w:pPr>
-      <w:r>
-        <w:rPr>
-          <w:rtl w:val="0"/>
-        </w:rPr>
-        <w:t xml:space="preserve">o cumprimento dos requisitos deste enunciado;</w:t>
+        <w:jc w:val="both"/>
+      </w:pPr>
+      <w:r>
+        <w:rPr>
+          <w:rtl w:val="0"/>
+        </w:rPr>
+        <w:t xml:space="preserve">cumprimento dos requisitos do enunciado;</w:t>
       </w:r>
     </w:p>
     <w:p>
@@ -276,15 +311,23 @@
         </w:numPr>
         <w:spacing w:after="160" w:before="160" w:line="240" w:lineRule="auto"/>
         <w:ind w:left="1440" w:hanging="360"/>
+        <w:jc w:val="both"/>
         <w:rPr>
           <w:u w:val="none"/>
         </w:rPr>
       </w:pPr>
       <w:r>
         <w:rPr>
-          <w:rtl w:val="0"/>
-        </w:rPr>
-        <w:t xml:space="preserve">a interface com o utilizador (facilidade de utilização da aplicação);</w:t>
+          <w:i w:val="1"/>
+          <w:rtl w:val="0"/>
+        </w:rPr>
+        <w:t xml:space="preserve">interface</w:t>
+      </w:r>
+      <w:r>
+        <w:rPr>
+          <w:rtl w:val="0"/>
+        </w:rPr>
+        <w:t xml:space="preserve"> com o utilizador (facilidade de utilização da aplicação).</w:t>
       </w:r>
     </w:p>
     <w:p>
@@ -292,7 +335,38 @@
         <w:keepLines w:val="1"/>
         <w:spacing w:after="160" w:before="160" w:line="240" w:lineRule="auto"/>
         <w:ind w:left="0" w:firstLine="0"/>
+        <w:jc w:val="both"/>
         <w:rPr/>
+      </w:pPr>
+      <w:r>
+        <w:rPr>
+          <w:rtl w:val="0"/>
+        </w:rPr>
+      </w:r>
+    </w:p>
+    <w:p>
+      <w:pPr>
+        <w:keepLines w:val="1"/>
+        <w:spacing w:after="160" w:before="160" w:line="240" w:lineRule="auto"/>
+        <w:jc w:val="both"/>
+        <w:rPr>
+          <w:b w:val="1"/>
+        </w:rPr>
+      </w:pPr>
+      <w:r>
+        <w:rPr>
+          <w:rtl w:val="0"/>
+        </w:rPr>
+      </w:r>
+    </w:p>
+    <w:p>
+      <w:pPr>
+        <w:keepLines w:val="1"/>
+        <w:spacing w:after="160" w:before="160" w:line="240" w:lineRule="auto"/>
+        <w:jc w:val="both"/>
+        <w:rPr>
+          <w:b w:val="1"/>
+        </w:rPr>
       </w:pPr>
       <w:r>
         <w:rPr>
@@ -307,36 +381,6 @@
         <w:jc w:val="center"/>
         <w:rPr>
           <w:b w:val="1"/>
-        </w:rPr>
-      </w:pPr>
-      <w:r>
-        <w:rPr>
-          <w:rtl w:val="0"/>
-        </w:rPr>
-      </w:r>
-    </w:p>
-    <w:p>
-      <w:pPr>
-        <w:keepLines w:val="1"/>
-        <w:spacing w:after="160" w:before="160" w:line="240" w:lineRule="auto"/>
-        <w:jc w:val="center"/>
-        <w:rPr>
-          <w:b w:val="1"/>
-        </w:rPr>
-      </w:pPr>
-      <w:r>
-        <w:rPr>
-          <w:rtl w:val="0"/>
-        </w:rPr>
-      </w:r>
-    </w:p>
-    <w:p>
-      <w:pPr>
-        <w:keepLines w:val="1"/>
-        <w:spacing w:after="160" w:before="160" w:line="240" w:lineRule="auto"/>
-        <w:jc w:val="center"/>
-        <w:rPr>
-          <w:b w:val="1"/>
           <w:sz w:val="28"/>
           <w:szCs w:val="28"/>
         </w:rPr>
@@ -362,19 +406,14 @@
       <w:pPr>
         <w:keepLines w:val="1"/>
         <w:spacing w:after="160" w:before="160" w:line="240" w:lineRule="auto"/>
+        <w:jc w:val="both"/>
         <w:rPr/>
       </w:pPr>
       <w:r>
         <w:rPr>
           <w:rtl w:val="0"/>
         </w:rPr>
-        <w:t xml:space="preserve"> O projeto foi, tal como indicado anteriormente, baseado num projeto feito para uma unidade curricular do semestre anterior, AEEDD (Algoritmos e Estruturas de Dados), sendo que esse projeto se encontra público num dos repositórios </w:t>
-      </w:r>
-      <w:r>
-        <w:rPr>
-          <w:rtl w:val="0"/>
-        </w:rPr>
-        <w:t xml:space="preserve">de </w:t>
+        <w:t xml:space="preserve"> O projeto foi, tal como indicado anteriormente, baseado num trabalho feito para uma unidade curricular do semestre anterior, AEEDD (Algoritmos e Estruturas de Dados), sendo que esse trabalho se encontra público num dos </w:t>
       </w:r>
       <w:hyperlink r:id="rId6">
         <w:r>
@@ -383,7 +422,7 @@
             <w:u w:val="single"/>
             <w:rtl w:val="0"/>
           </w:rPr>
-          <w:t xml:space="preserve">GitHub</w:t>
+          <w:t xml:space="preserve">repositórios do GitHub</w:t>
         </w:r>
       </w:hyperlink>
       <w:r>
@@ -397,19 +436,21 @@
       <w:pPr>
         <w:keepLines w:val="1"/>
         <w:spacing w:after="160" w:before="160" w:line="240" w:lineRule="auto"/>
+        <w:jc w:val="both"/>
         <w:rPr/>
       </w:pPr>
       <w:r>
         <w:rPr>
           <w:rtl w:val="0"/>
         </w:rPr>
-        <w:t xml:space="preserve">Uma das alterações mais significativas foi a passagem de um sistema de memória fixa e 100% volátil para um sistema maioritariamente em memória física, e a memória volátil que fosse necessária seria dinamicamente alocada.</w:t>
+        <w:t xml:space="preserve">Uma das alterações mais significativas foi a passagem de um sistema de memória fixa e 100% volátil para um sistema maioritariamente em memória física, com a memória volátil que fosse necessária a ser dinamicamente alocada.</w:t>
       </w:r>
     </w:p>
     <w:p>
       <w:pPr>
         <w:keepLines w:val="1"/>
         <w:spacing w:after="160" w:before="160" w:line="240" w:lineRule="auto"/>
+        <w:jc w:val="both"/>
         <w:rPr/>
       </w:pPr>
       <w:r>
@@ -429,38 +470,53 @@
         <w:rPr>
           <w:rtl w:val="0"/>
         </w:rPr>
-        <w:t xml:space="preserve"> com grande relevância foi a interface com o utilizador, que agora é mais responsiva e mais robusta, ainda que infelizmente não tenha sido completada devido </w:t>
-      </w:r>
-      <w:r>
-        <w:rPr>
-          <w:rtl w:val="0"/>
-        </w:rPr>
-        <w:t xml:space="preserve">a leve</w:t>
-      </w:r>
-      <w:r>
-        <w:rPr>
-          <w:rtl w:val="0"/>
-        </w:rPr>
-        <w:t xml:space="preserve"> falta de tempo.</w:t>
+        <w:t xml:space="preserve"> com grande relevância foi a </w:t>
+      </w:r>
+      <w:r>
+        <w:rPr>
+          <w:i w:val="1"/>
+          <w:rtl w:val="0"/>
+        </w:rPr>
+        <w:t xml:space="preserve">interface</w:t>
+      </w:r>
+      <w:r>
+        <w:rPr>
+          <w:rtl w:val="0"/>
+        </w:rPr>
+        <w:t xml:space="preserve"> com o utilizador, que agora é mais responsiva e mais robusta, ainda que infelizmente não tenha sido completada devido </w:t>
+      </w:r>
+      <w:r>
+        <w:rPr>
+          <w:rtl w:val="0"/>
+        </w:rPr>
+        <w:t xml:space="preserve">a falta</w:t>
+      </w:r>
+      <w:r>
+        <w:rPr>
+          <w:rtl w:val="0"/>
+        </w:rPr>
+        <w:t xml:space="preserve"> de tempo.</w:t>
       </w:r>
     </w:p>
     <w:p>
       <w:pPr>
         <w:keepLines w:val="1"/>
         <w:spacing w:after="160" w:before="160" w:line="240" w:lineRule="auto"/>
+        <w:jc w:val="both"/>
         <w:rPr/>
       </w:pPr>
       <w:r>
         <w:rPr>
           <w:rtl w:val="0"/>
         </w:rPr>
-        <w:t xml:space="preserve">A estruturação do projeto também sofreu uma intervenção intensiva, tendo sido passado de um único ficheiro de mais de 2000 linhas para vários ficheiros, cada um com a sua funcionalidade para uma melhor organização e orientação no desenvolvimento do projeto . Cada ficheiro possui um nome relativo à sua funcionalidade, de forma a ser intuitivo o processo de procura e/ou uso de funções neles contidas.</w:t>
+        <w:t xml:space="preserve">A estruturação do projeto também sofreu uma intervenção intensiva, tendo sido passado de um único ficheiro de mais de 2000 linhas para vários ficheiros, cada um com a sua funcionalidade para uma melhor organização e orientação no desenvolvimento do projeto. Cada ficheiro possui um nome relativo à sua funcionalidade, de forma a tornar intuitivo o processo de procura e/ou uso de funções neles contidas.</w:t>
       </w:r>
     </w:p>
     <w:p>
       <w:pPr>
         <w:keepLines w:val="1"/>
         <w:spacing w:after="200" w:before="200" w:line="240" w:lineRule="auto"/>
+        <w:jc w:val="both"/>
         <w:rPr/>
       </w:pPr>
       <w:r>
@@ -473,6 +529,7 @@
       <w:pPr>
         <w:keepLines w:val="1"/>
         <w:spacing w:after="200" w:before="200" w:line="240" w:lineRule="auto"/>
+        <w:jc w:val="both"/>
         <w:rPr/>
       </w:pPr>
       <w:r>
@@ -485,6 +542,7 @@
       <w:pPr>
         <w:keepLines w:val="1"/>
         <w:spacing w:after="200" w:before="200" w:line="240" w:lineRule="auto"/>
+        <w:jc w:val="both"/>
         <w:rPr/>
       </w:pPr>
       <w:r>
@@ -497,6 +555,7 @@
       <w:pPr>
         <w:keepLines w:val="1"/>
         <w:spacing w:after="200" w:before="200" w:line="240" w:lineRule="auto"/>
+        <w:jc w:val="both"/>
         <w:rPr/>
       </w:pPr>
       <w:r>
@@ -509,6 +568,7 @@
       <w:pPr>
         <w:keepLines w:val="1"/>
         <w:spacing w:after="200" w:before="200" w:line="240" w:lineRule="auto"/>
+        <w:jc w:val="both"/>
         <w:rPr/>
       </w:pPr>
       <w:r>
@@ -521,6 +581,7 @@
       <w:pPr>
         <w:keepLines w:val="1"/>
         <w:spacing w:after="200" w:before="200" w:line="240" w:lineRule="auto"/>
+        <w:jc w:val="both"/>
         <w:rPr/>
       </w:pPr>
       <w:r>
@@ -533,7 +594,25 @@
       <w:pPr>
         <w:keepLines w:val="1"/>
         <w:spacing w:after="200" w:before="200" w:line="240" w:lineRule="auto"/>
+        <w:jc w:val="both"/>
         <w:rPr/>
+      </w:pPr>
+      <w:r>
+        <w:rPr>
+          <w:rtl w:val="0"/>
+        </w:rPr>
+      </w:r>
+    </w:p>
+    <w:p>
+      <w:pPr>
+        <w:keepLines w:val="1"/>
+        <w:spacing w:after="200" w:before="200" w:line="240" w:lineRule="auto"/>
+        <w:jc w:val="both"/>
+        <w:rPr>
+          <w:b w:val="1"/>
+          <w:sz w:val="28"/>
+          <w:szCs w:val="28"/>
+        </w:rPr>
       </w:pPr>
       <w:r>
         <w:rPr>
@@ -548,10 +627,19 @@
         <w:jc w:val="center"/>
         <w:rPr>
           <w:b w:val="1"/>
+          <w:sz w:val="32"/>
+          <w:szCs w:val="32"/>
+        </w:rPr>
+      </w:pPr>
+      <w:r>
+        <w:rPr>
+          <w:b w:val="1"/>
           <w:sz w:val="28"/>
           <w:szCs w:val="28"/>
-        </w:rPr>
-      </w:pPr>
+          <w:rtl w:val="0"/>
+        </w:rPr>
+        <w:t xml:space="preserve">3. Autoavaliação</w:t>
+      </w:r>
       <w:r>
         <w:rPr>
           <w:rtl w:val="0"/>
@@ -562,33 +650,7 @@
       <w:pPr>
         <w:keepLines w:val="1"/>
         <w:spacing w:after="200" w:before="200" w:line="240" w:lineRule="auto"/>
-        <w:jc w:val="center"/>
-        <w:rPr>
-          <w:b w:val="1"/>
-          <w:sz w:val="32"/>
-          <w:szCs w:val="32"/>
-        </w:rPr>
-      </w:pPr>
-      <w:r>
-        <w:rPr>
-          <w:b w:val="1"/>
-          <w:sz w:val="28"/>
-          <w:szCs w:val="28"/>
-          <w:rtl w:val="0"/>
-        </w:rPr>
-        <w:t xml:space="preserve">3. Autoavaliação</w:t>
-      </w:r>
-      <w:r>
-        <w:rPr>
-          <w:rtl w:val="0"/>
-        </w:rPr>
-      </w:r>
-    </w:p>
-    <w:p>
-      <w:pPr>
-        <w:keepLines w:val="1"/>
-        <w:spacing w:after="200" w:before="200" w:line="240" w:lineRule="auto"/>
-        <w:jc w:val="left"/>
+        <w:jc w:val="both"/>
         <w:rPr/>
       </w:pPr>
       <w:r>
@@ -607,14 +669,14 @@
         <w:rPr>
           <w:rtl w:val="0"/>
         </w:rPr>
-        <w:t xml:space="preserve"> tem como objetivo apresentar a nossa autoavaliação, rebatendo os diferentes pontos que carecem de avaliação </w:t>
-      </w:r>
-      <w:r>
-        <w:rPr>
-          <w:b w:val="1"/>
-          <w:rtl w:val="0"/>
-        </w:rPr>
-        <w:t xml:space="preserve">(Nota: Visto que a nota será de 0 a 20 e há 4 pontos, assumimos que cada ponto valerá 5 pontos.)</w:t>
+        <w:t xml:space="preserve"> tem como objetivo apresentar a nossa autoavaliação, abordando os diferentes pontos que são visados na avaliação </w:t>
+      </w:r>
+      <w:r>
+        <w:rPr>
+          <w:b w:val="1"/>
+          <w:rtl w:val="0"/>
+        </w:rPr>
+        <w:t xml:space="preserve">(Nota: Visto que a nota final será de 0 a 20 valores e existem quatro pontos a abordar, assumimos que cada ponto valerá 5 valores)</w:t>
       </w:r>
       <w:r>
         <w:rPr>
@@ -632,6 +694,7 @@
         </w:numPr>
         <w:spacing w:after="200" w:before="200" w:line="240" w:lineRule="auto"/>
         <w:ind w:left="1440" w:hanging="360"/>
+        <w:jc w:val="both"/>
       </w:pPr>
       <w:r>
         <w:rPr>
@@ -644,7 +707,7 @@
         <w:rPr>
           <w:rtl w:val="0"/>
         </w:rPr>
-        <w:t xml:space="preserve"> Relativamente a este ponto, o projeto encontra-se dividido em diversos ficheiros, tendo estes um objetivo e motivo bem definido e refletido no nome  (por exemplo </w:t>
+        <w:t xml:space="preserve"> relativamente a este ponto, o projeto encontra-se dividido em diversos ficheiros, tendo estes um objetivo e motivo bem definido e refletido no nome  (por exemplo </w:t>
       </w:r>
       <w:r>
         <w:rPr>
@@ -664,13 +727,13 @@
           <w:i w:val="1"/>
           <w:rtl w:val="0"/>
         </w:rPr>
-        <w:t xml:space="preserve">struck.c</w:t>
-      </w:r>
-      <w:r>
-        <w:rPr>
-          <w:rtl w:val="0"/>
-        </w:rPr>
-        <w:t xml:space="preserve">, etc…). Alguns destes ficheiros, além de serem simplesmente partes do projeto principal, são autênticas bibliotecas, podendo ser facilmente portadas para outro projeto (</w:t>
+        <w:t xml:space="preserve">typedefs.c</w:t>
+      </w:r>
+      <w:r>
+        <w:rPr>
+          <w:rtl w:val="0"/>
+        </w:rPr>
+        <w:t xml:space="preserve">, etc…). Alguns destes ficheiros, além de serem simplesmente partes do projeto principal, são autênticas bibliotecas, podendo ser facilmente usadas sem alteração noutro projeto (</w:t>
       </w:r>
       <w:r>
         <w:rPr>
@@ -703,13 +766,26 @@
           <w:b w:val="1"/>
           <w:rtl w:val="0"/>
         </w:rPr>
-        <w:t xml:space="preserve">4.5 pontos</w:t>
-      </w:r>
-      <w:r>
-        <w:rPr>
-          <w:rtl w:val="0"/>
-        </w:rPr>
-        <w:t xml:space="preserve">, tendo 1 ponto sido retirado devido à falta de ficheiros heather (</w:t>
+        <w:t xml:space="preserve">4.5 valores</w:t>
+      </w:r>
+      <w:r>
+        <w:rPr>
+          <w:rtl w:val="0"/>
+        </w:rPr>
+        <w:t xml:space="preserve">, tendo 0.5 valores sido retirados devido à falta de ficheiros </w:t>
+      </w:r>
+      <w:r>
+        <w:rPr>
+          <w:i w:val="1"/>
+          <w:rtl w:val="0"/>
+        </w:rPr>
+        <w:t xml:space="preserve">header</w:t>
+      </w:r>
+      <w:r>
+        <w:rPr>
+          <w:rtl w:val="0"/>
+        </w:rPr>
+        <w:t xml:space="preserve"> (</w:t>
       </w:r>
       <w:r>
         <w:rPr>
@@ -722,7 +798,7 @@
         <w:rPr>
           <w:rtl w:val="0"/>
         </w:rPr>
-        <w:t xml:space="preserve"> e algumas variáveis terem nomes de desespero (por exemplo </w:t>
+        <w:t xml:space="preserve"> e algumas variáveis terem nomes de “desespero” (por exemplo  </w:t>
       </w:r>
       <w:r>
         <w:rPr>
@@ -760,6 +836,7 @@
         </w:numPr>
         <w:spacing w:after="200" w:before="200" w:line="240" w:lineRule="auto"/>
         <w:ind w:left="1440" w:hanging="360"/>
+        <w:jc w:val="both"/>
         <w:rPr>
           <w:b w:val="1"/>
         </w:rPr>
@@ -775,7 +852,20 @@
         <w:rPr>
           <w:rtl w:val="0"/>
         </w:rPr>
-        <w:t xml:space="preserve">Na opinião da maioria dos membros do projeto, a programação em si está um pouco complicada, devido à obsessão de um dos membros em usar o mínimo de memória volátil possível. Essa obsessão levou à programação ser quase um assembly de alto nível, trabalhando em ficheiros do disco como se fossem uma string em RAM. No entanto, a programação é robusta, tendo sido usadas quase 100% de bibliotecas default do C, excetuando uma biblioteca (especificamente </w:t>
+        <w:t xml:space="preserve">na opinião da maioria dos membros do projeto, a programação em si está um pouco complicada, devido à obsessão de um dos membros em usar o mínimo de memória volátil possível. Essa obsessão levou a que a programação fosse quase um </w:t>
+      </w:r>
+      <w:r>
+        <w:rPr>
+          <w:i w:val="1"/>
+          <w:rtl w:val="0"/>
+        </w:rPr>
+        <w:t xml:space="preserve">assembly</w:t>
+      </w:r>
+      <w:r>
+        <w:rPr>
+          <w:rtl w:val="0"/>
+        </w:rPr>
+        <w:t xml:space="preserve"> de alto nível, trabalhando em ficheiros do disco como se fossem uma string em RAM. No entanto, a programação é robusta, tendo sido usadas quase 100% de bibliotecas default do C, excetuando uma biblioteca (especificamente </w:t>
       </w:r>
       <w:r>
         <w:rPr>
@@ -788,20 +878,33 @@
         <w:rPr>
           <w:rtl w:val="0"/>
         </w:rPr>
-        <w:t xml:space="preserve">) apenas presente em sistemas operativos UNIX-Like. Foi pensada uma maneira de tornar portável para Windows, mas de novo ficou-se sem tempo. Na nossa opinião, achamos que deveríamos ter </w:t>
-      </w:r>
-      <w:r>
-        <w:rPr>
-          <w:b w:val="1"/>
-          <w:rtl w:val="0"/>
-        </w:rPr>
-        <w:t xml:space="preserve">4 pontos</w:t>
-      </w:r>
-      <w:r>
-        <w:rPr>
-          <w:rtl w:val="0"/>
-        </w:rPr>
-        <w:t xml:space="preserve">, sendo 1 ponto retirado pela complexidade do programa.</w:t>
+        <w:t xml:space="preserve">) apenas presente em sistemas operativos UNIX-Like. Foi idealizada uma maneira de tornar </w:t>
+      </w:r>
+      <w:r>
+        <w:rPr>
+          <w:i w:val="1"/>
+          <w:rtl w:val="0"/>
+        </w:rPr>
+        <w:t xml:space="preserve">portable</w:t>
+      </w:r>
+      <w:r>
+        <w:rPr>
+          <w:rtl w:val="0"/>
+        </w:rPr>
+        <w:t xml:space="preserve"> para Windows, mas de novo não houve tempo suficiente. Na nossa opinião, achamos que deveríamos ter </w:t>
+      </w:r>
+      <w:r>
+        <w:rPr>
+          <w:b w:val="1"/>
+          <w:rtl w:val="0"/>
+        </w:rPr>
+        <w:t xml:space="preserve">4 valores</w:t>
+      </w:r>
+      <w:r>
+        <w:rPr>
+          <w:rtl w:val="0"/>
+        </w:rPr>
+        <w:t xml:space="preserve">, sendo 1 valor retirado pela complexidade do programa.</w:t>
       </w:r>
       <w:r>
         <w:rPr>
@@ -818,22 +921,23 @@
         </w:numPr>
         <w:spacing w:after="200" w:before="200" w:line="240" w:lineRule="auto"/>
         <w:ind w:left="1440" w:hanging="360"/>
-        <w:rPr>
-          <w:b w:val="1"/>
-        </w:rPr>
-      </w:pPr>
-      <w:r>
-        <w:rPr>
-          <w:b w:val="1"/>
-          <w:rtl w:val="0"/>
-        </w:rPr>
-        <w:t xml:space="preserve">Cumprimento dos requisitos deste enunciado: </w:t>
-      </w:r>
-      <w:r>
-        <w:rPr>
-          <w:rtl w:val="0"/>
-        </w:rPr>
-        <w:t xml:space="preserve">Consideramos que não só cumprimos todos os requisitos como fomos para além deles, acrescentando opções que achávamos importantes. O único requisito que consideramos que poderia ter sido melhor seria a documentação do código. O ficheiro </w:t>
+        <w:jc w:val="both"/>
+        <w:rPr>
+          <w:b w:val="1"/>
+        </w:rPr>
+      </w:pPr>
+      <w:r>
+        <w:rPr>
+          <w:b w:val="1"/>
+          <w:rtl w:val="0"/>
+        </w:rPr>
+        <w:t xml:space="preserve">Cumprimento dos requisitos do enunciado: </w:t>
+      </w:r>
+      <w:r>
+        <w:rPr>
+          <w:rtl w:val="0"/>
+        </w:rPr>
+        <w:t xml:space="preserve">consideramos que não só cumprimos todos os requisitos como fomos para além deles, acrescentando opções que achávamos importantes. O único requisito que consideramos que poderia ter sido melhor implementado é a documentação do código. O ficheiro </w:t>
       </w:r>
       <w:r>
         <w:rPr>
@@ -846,7 +950,7 @@
         <w:rPr>
           <w:rtl w:val="0"/>
         </w:rPr>
-        <w:t xml:space="preserve"> foi 100% comentado, mas os restantes ficheiros encontram-se ou apenas parcialmente comentados, inclusivamente com alguns comentários incorretos, pois não foram atualizados junto com o </w:t>
+        <w:t xml:space="preserve"> foi 100% comentado, mas os restantes ficheiros encontram-se ou apenas parcialmente comentados ou até mesmo com alguns comentários incorretos, pois não foram atualizados junto com o </w:t>
       </w:r>
       <w:r>
         <w:rPr>
@@ -858,20 +962,20 @@
         <w:rPr>
           <w:rtl w:val="0"/>
         </w:rPr>
-        <w:t xml:space="preserve"> código. Infelizmente não houve tempo para dar uma última revisão no código. Consideramos por isso que deveríamos receber </w:t>
-      </w:r>
-      <w:r>
-        <w:rPr>
-          <w:b w:val="1"/>
-          <w:rtl w:val="0"/>
-        </w:rPr>
-        <w:t xml:space="preserve">3.5 pontos</w:t>
-      </w:r>
-      <w:r>
-        <w:rPr>
-          <w:rtl w:val="0"/>
-        </w:rPr>
-        <w:t xml:space="preserve">, sendo 1.5 pontos retirados pela incorreção de alguns comentários e falta de outros.</w:t>
+        <w:t xml:space="preserve"> código. Infelizmente não houve tempo para dar uma última revisão ao código. Consideramos por isso que deveríamos receber </w:t>
+      </w:r>
+      <w:r>
+        <w:rPr>
+          <w:b w:val="1"/>
+          <w:rtl w:val="0"/>
+        </w:rPr>
+        <w:t xml:space="preserve">3.5 valores</w:t>
+      </w:r>
+      <w:r>
+        <w:rPr>
+          <w:rtl w:val="0"/>
+        </w:rPr>
+        <w:t xml:space="preserve">, sendo 1.5 valores retirados pela incorreção de alguns comentários e falta de outros.</w:t>
       </w:r>
     </w:p>
     <w:p>
@@ -883,35 +987,132 @@
         </w:numPr>
         <w:spacing w:after="200" w:before="200" w:line="240" w:lineRule="auto"/>
         <w:ind w:left="1440" w:hanging="360"/>
-        <w:rPr>
-          <w:b w:val="1"/>
-        </w:rPr>
-      </w:pPr>
-      <w:r>
-        <w:rPr>
-          <w:b w:val="1"/>
-          <w:rtl w:val="0"/>
-        </w:rPr>
-        <w:t xml:space="preserve">Interface com o utilizador:</w:t>
-      </w:r>
-      <w:r>
-        <w:rPr>
-          <w:rtl w:val="0"/>
-        </w:rPr>
-        <w:t xml:space="preserve"> Dada a obsessão de um dos membros deste grupo por interfaces “à prova de utilizadores inexperientes” e “que dê orgulho de olhar”, uma grande parte do tempo de desenvolvimento foi dedicado à criação da interface gráfica. Infelizmente, algumas das opções não tiveram tempo de ser revistas e colocadas na interface desenvolvida. No entanto, devido à complexidade de criação e facilidade de uso pelo utilizador, consideramos que deveríamos receber </w:t>
-      </w:r>
-      <w:r>
-        <w:rPr>
-          <w:b w:val="1"/>
-          <w:rtl w:val="0"/>
-        </w:rPr>
-        <w:t xml:space="preserve">4.5 pontos</w:t>
-      </w:r>
-      <w:r>
-        <w:rPr>
-          <w:rtl w:val="0"/>
-        </w:rPr>
-        <w:t xml:space="preserve">, tendo 0.5 pontos sido retirados pelo facto de a interface não ter sido colocada em todos os “lados”.</w:t>
+        <w:jc w:val="both"/>
+        <w:rPr>
+          <w:b w:val="1"/>
+        </w:rPr>
+      </w:pPr>
+      <w:r>
+        <w:rPr>
+          <w:b w:val="1"/>
+          <w:i w:val="1"/>
+          <w:rtl w:val="0"/>
+        </w:rPr>
+        <w:t xml:space="preserve">Interface</w:t>
+      </w:r>
+      <w:r>
+        <w:rPr>
+          <w:b w:val="1"/>
+          <w:rtl w:val="0"/>
+        </w:rPr>
+        <w:t xml:space="preserve"> com o utilizador:</w:t>
+      </w:r>
+      <w:r>
+        <w:rPr>
+          <w:rtl w:val="0"/>
+        </w:rPr>
+        <w:t xml:space="preserve"> dada a determinação de um dos membros do grupo de tornar a </w:t>
+      </w:r>
+      <w:r>
+        <w:rPr>
+          <w:i w:val="1"/>
+          <w:rtl w:val="0"/>
+        </w:rPr>
+        <w:t xml:space="preserve">interface</w:t>
+      </w:r>
+      <w:r>
+        <w:rPr>
+          <w:rtl w:val="0"/>
+        </w:rPr>
+        <w:t xml:space="preserve"> “à prova de utilizadores inexperientes” e “que dê orgulho de olhar”, uma grande parte do tempo de desenvolvimento foi dedicado à criação da </w:t>
+      </w:r>
+      <w:r>
+        <w:rPr>
+          <w:i w:val="1"/>
+          <w:rtl w:val="0"/>
+        </w:rPr>
+        <w:t xml:space="preserve">interface</w:t>
+      </w:r>
+      <w:r>
+        <w:rPr>
+          <w:rtl w:val="0"/>
+        </w:rPr>
+        <w:t xml:space="preserve"> gráfica. Infelizmente, algumas das opções não tiveram tempo de ser revistas e colocadas na </w:t>
+      </w:r>
+      <w:r>
+        <w:rPr>
+          <w:i w:val="1"/>
+          <w:rtl w:val="0"/>
+        </w:rPr>
+        <w:t xml:space="preserve">interface</w:t>
+      </w:r>
+      <w:r>
+        <w:rPr>
+          <w:rtl w:val="0"/>
+        </w:rPr>
+        <w:t xml:space="preserve"> desenvolvida. No entanto, devido à complexidade de criação e facilidade de uso pelo utilizador, consideramos que deveríamos receber </w:t>
+      </w:r>
+      <w:r>
+        <w:rPr>
+          <w:b w:val="1"/>
+          <w:rtl w:val="0"/>
+        </w:rPr>
+        <w:t xml:space="preserve">4.5 valores</w:t>
+      </w:r>
+      <w:r>
+        <w:rPr>
+          <w:rtl w:val="0"/>
+        </w:rPr>
+        <w:t xml:space="preserve">, tendo 0.5 valores sido retirados pelo facto de a </w:t>
+      </w:r>
+      <w:r>
+        <w:rPr>
+          <w:i w:val="1"/>
+          <w:rtl w:val="0"/>
+        </w:rPr>
+        <w:t xml:space="preserve">interface</w:t>
+      </w:r>
+      <w:r>
+        <w:rPr>
+          <w:rtl w:val="0"/>
+        </w:rPr>
+        <w:t xml:space="preserve"> não ter sido aplicada no programa inteiro.</w:t>
+      </w:r>
+    </w:p>
+    <w:p>
+      <w:pPr>
+        <w:keepLines w:val="1"/>
+        <w:spacing w:after="100" w:before="100" w:line="240" w:lineRule="auto"/>
+        <w:ind w:left="0" w:firstLine="0"/>
+        <w:jc w:val="both"/>
+        <w:rPr>
+          <w:b w:val="1"/>
+          <w:sz w:val="32"/>
+          <w:szCs w:val="32"/>
+        </w:rPr>
+      </w:pPr>
+      <w:r>
+        <w:rPr>
+          <w:rtl w:val="0"/>
+        </w:rPr>
+      </w:r>
+    </w:p>
+    <w:p>
+      <w:pPr>
+        <w:keepLines w:val="1"/>
+        <w:spacing w:after="100" w:before="100" w:line="240" w:lineRule="auto"/>
+        <w:ind w:left="0" w:firstLine="0"/>
+        <w:jc w:val="both"/>
+        <w:rPr>
+          <w:b w:val="1"/>
+          <w:sz w:val="32"/>
+          <w:szCs w:val="32"/>
+        </w:rPr>
+      </w:pPr>
+      <w:r>
+        <w:rPr>
+          <w:rtl w:val="0"/>
+        </w:rPr>
       </w:r>
     </w:p>
     <w:p>
@@ -928,8 +1129,12 @@
       </w:pPr>
       <w:r>
         <w:rPr>
-          <w:rtl w:val="0"/>
-        </w:rPr>
+          <w:b w:val="1"/>
+          <w:sz w:val="32"/>
+          <w:szCs w:val="32"/>
+          <w:rtl w:val="0"/>
+        </w:rPr>
+        <w:t xml:space="preserve">Conclusão</w:t>
       </w:r>
     </w:p>
     <w:p>
@@ -937,54 +1142,40 @@
         <w:keepLines w:val="1"/>
         <w:spacing w:after="100" w:before="100" w:line="240" w:lineRule="auto"/>
         <w:ind w:left="0" w:firstLine="0"/>
-        <w:jc w:val="center"/>
-        <w:rPr>
-          <w:b w:val="1"/>
-          <w:sz w:val="32"/>
-          <w:szCs w:val="32"/>
-        </w:rPr>
-      </w:pPr>
-      <w:r>
-        <w:rPr>
-          <w:rtl w:val="0"/>
-        </w:rPr>
-      </w:r>
-    </w:p>
-    <w:p>
-      <w:pPr>
-        <w:keepLines w:val="1"/>
-        <w:spacing w:after="100" w:before="100" w:line="240" w:lineRule="auto"/>
-        <w:ind w:left="0" w:firstLine="0"/>
-        <w:jc w:val="center"/>
-        <w:rPr>
-          <w:b w:val="1"/>
-          <w:sz w:val="32"/>
-          <w:szCs w:val="32"/>
-        </w:rPr>
-      </w:pPr>
-      <w:r>
-        <w:rPr>
-          <w:b w:val="1"/>
-          <w:sz w:val="32"/>
-          <w:szCs w:val="32"/>
-          <w:rtl w:val="0"/>
-        </w:rPr>
-        <w:t xml:space="preserve">Conclusão</w:t>
-      </w:r>
-    </w:p>
-    <w:p>
-      <w:pPr>
-        <w:keepLines w:val="1"/>
-        <w:spacing w:after="100" w:before="100" w:line="240" w:lineRule="auto"/>
-        <w:ind w:left="0" w:firstLine="0"/>
-        <w:jc w:val="left"/>
+        <w:jc w:val="both"/>
         <w:rPr/>
       </w:pPr>
       <w:r>
         <w:rPr>
           <w:rtl w:val="0"/>
         </w:rPr>
-        <w:t xml:space="preserve">Em suma, consideramos que devemos receber 16.5, arredondando, 17. Consideramos que o nosso trabalho foi bem desenvolvido, bem organizado e prático para os utilizadores. O trabalho foi desenvolvido mais ou menos irmamente, ainda que devido a certas obsessões, muito do código escrito pelos restantes membros acabou por ser reescrito aquando do </w:t>
+        <w:t xml:space="preserve">Em suma, consideramos que devemos receber 16.5 valores, arredondando, </w:t>
+      </w:r>
+      <w:r>
+        <w:rPr>
+          <w:b w:val="1"/>
+          <w:rtl w:val="0"/>
+        </w:rPr>
+        <w:t xml:space="preserve">17 valores</w:t>
+      </w:r>
+      <w:r>
+        <w:rPr>
+          <w:rtl w:val="0"/>
+        </w:rPr>
+        <w:t xml:space="preserve">. Consideramos que o nosso trabalho foi bem desenvolvido, bem organizado e prático para os utilizadores. O trabalho foi desenvolvido mais ou menos irmamente, ainda que devido a certas escolhas por parte do membro escolhido para tratar do </w:t>
+      </w:r>
+      <w:r>
+        <w:rPr>
+          <w:i w:val="1"/>
+          <w:rtl w:val="0"/>
+        </w:rPr>
+        <w:t xml:space="preserve">branch</w:t>
+      </w:r>
+      <w:r>
+        <w:rPr>
+          <w:rtl w:val="0"/>
+        </w:rPr>
+        <w:t xml:space="preserve"> principal, muito do código escrito pelos restantes membros acabou por ser reescrito pelo membro referido aquando do  </w:t>
       </w:r>
       <w:r>
         <w:rPr>

</xml_diff>